<commit_message>
Improve scientists list mobile UX, sync sidebar scrolling, and rebuild Deployment.
Scientists directory shows hidden columns under names on narrow screens with striped rows; table resize stays aligned on resize. Forum presentations, rectors, academicians, and News pages get proportional sidebar/main scroll sync. Rebuild Deployment package including images.

Co-authored-by: Cursor <cursoragent@cursor.com>
</commit_message>
<xml_diff>
--- a/documents/docx/Forumla bağlı kitaba annotasiya.docx
+++ b/documents/docx/Forumla bağlı kitaba annotasiya.docx
@@ -255,6 +255,10 @@
     <w:p>
       <w:pPr>
         <w:jc w:val="both"/>
+        <w:rPr>
+          <w:b/>
+          <w:bCs/>
+        </w:rPr>
       </w:pPr>
     </w:p>
     <w:p>

</xml_diff>